<commit_message>
feat(agent): add tray companion ADR and control prototype
</commit_message>
<xml_diff>
--- a/docs/planning/Engineering_Backlog_v1.0_Part_1_Project_Foundation.docx
+++ b/docs/planning/Engineering_Backlog_v1.0_Part_1_Project_Foundation.docx
@@ -1211,7 +1211,7 @@
     </w:p>
     <w:p>
       <w:r>
-        <w:t>Windows service/tray application providing trusted local data.</w:t>
+        <w:t>Roadmap tasks 2.3-01 through 2.3-10 define the Local Agent sequence. Dormant telemetry transport was implemented before Version 2.2.0; it is not Tray Companion functionality, is not registered for production execution, and must not be activated by Task 2.3-03.</w:t>
       </w:r>
     </w:p>
     <w:tbl>
@@ -1285,7 +1285,7 @@
           </w:tcPr>
           <w:p>
             <w:r>
-              <w:t>E2-001</w:t>
+              <w:t>2.3-01</w:t>
             </w:r>
           </w:p>
         </w:tc>
@@ -1295,7 +1295,7 @@
           </w:tcPr>
           <w:p>
             <w:r>
-              <w:t>Windows Service</w:t>
+              <w:t>Technology Spike</w:t>
             </w:r>
           </w:p>
         </w:tc>
@@ -1325,7 +1325,7 @@
           </w:tcPr>
           <w:p>
             <w:r>
-              <w:t>Implemented and verified</w:t>
+              <w:t>Complete â€” ADR-001 and ADR-002 accepted; service and transport prototypes validated.</w:t>
             </w:r>
           </w:p>
         </w:tc>
@@ -1337,7 +1337,59 @@
           </w:tcPr>
           <w:p>
             <w:r>
-              <w:t>E2-002</w:t>
+              <w:t>2.3-02</w:t>
+            </w:r>
+          </w:p>
+        </w:tc>
+        <w:tc>
+          <w:tcPr>
+            <w:tcW w:type="dxa" w:w="1728"/>
+          </w:tcPr>
+          <w:p>
+            <w:r>
+              <w:t>Windows Service Skeleton</w:t>
+            </w:r>
+          </w:p>
+        </w:tc>
+        <w:tc>
+          <w:tcPr>
+            <w:tcW w:type="dxa" w:w="1728"/>
+          </w:tcPr>
+          <w:p>
+            <w:r>
+              <w:t>P0</w:t>
+            </w:r>
+          </w:p>
+        </w:tc>
+        <w:tc>
+          <w:tcPr>
+            <w:tcW w:type="dxa" w:w="1728"/>
+          </w:tcPr>
+          <w:p>
+            <w:r>
+              <w:t>S</w:t>
+            </w:r>
+          </w:p>
+        </w:tc>
+        <w:tc>
+          <w:tcPr>
+            <w:tcW w:type="dxa" w:w="1728"/>
+          </w:tcPr>
+          <w:p>
+            <w:r>
+              <w:t>Implementation complete; representative ToughPad/ToughBook hardware validation pending.</w:t>
+            </w:r>
+          </w:p>
+        </w:tc>
+      </w:tr>
+      <w:tr>
+        <w:tc>
+          <w:tcPr>
+            <w:tcW w:type="dxa" w:w="1728"/>
+          </w:tcPr>
+          <w:p>
+            <w:r>
+              <w:t>2.3-03</w:t>
             </w:r>
           </w:p>
         </w:tc>
@@ -1377,7 +1429,7 @@
           </w:tcPr>
           <w:p>
             <w:r>
-              <w:t>Implemented and verified</w:t>
+              <w:t>Partially implemented â€” ADR-003 and the disposable prototype are implemented. Native health-client provisioning and real multi-identity ACL validation are active prerequisites. Production UI, packaging, startup, and hardware validation remain incomplete. Telemetry remains dormant and outside scope.</w:t>
             </w:r>
           </w:p>
         </w:tc>
@@ -1389,7 +1441,7 @@
           </w:tcPr>
           <w:p>
             <w:r>
-              <w:t>E2-003</w:t>
+              <w:t>2.3-04</w:t>
             </w:r>
           </w:p>
         </w:tc>
@@ -1399,59 +1451,7 @@
           </w:tcPr>
           <w:p>
             <w:r>
-              <w:t>Capability Registry</w:t>
-            </w:r>
-          </w:p>
-        </w:tc>
-        <w:tc>
-          <w:tcPr>
-            <w:tcW w:type="dxa" w:w="1728"/>
-          </w:tcPr>
-          <w:p>
-            <w:r>
-              <w:t>P0</w:t>
-            </w:r>
-          </w:p>
-        </w:tc>
-        <w:tc>
-          <w:tcPr>
-            <w:tcW w:type="dxa" w:w="1728"/>
-          </w:tcPr>
-          <w:p>
-            <w:r>
-              <w:t>S</w:t>
-            </w:r>
-          </w:p>
-        </w:tc>
-        <w:tc>
-          <w:tcPr>
-            <w:tcW w:type="dxa" w:w="1728"/>
-          </w:tcPr>
-          <w:p>
-            <w:r>
-              <w:t>Implemented and verified</w:t>
-            </w:r>
-          </w:p>
-        </w:tc>
-      </w:tr>
-      <w:tr>
-        <w:tc>
-          <w:tcPr>
-            <w:tcW w:type="dxa" w:w="1728"/>
-          </w:tcPr>
-          <w:p>
-            <w:r>
-              <w:t>E2-004</w:t>
-            </w:r>
-          </w:p>
-        </w:tc>
-        <w:tc>
-          <w:tcPr>
-            <w:tcW w:type="dxa" w:w="1728"/>
-          </w:tcPr>
-          <w:p>
-            <w:r>
-              <w:t>SQLite</w:t>
+              <w:t>Secure Local API</w:t>
             </w:r>
           </w:p>
         </w:tc>
@@ -1481,7 +1481,7 @@
           </w:tcPr>
           <w:p>
             <w:r>
-              <w:t>Implemented and verified</w:t>
+              <w:t>Partially implemented â€” authenticated loopback health exists; complete schema, rate, origin, and privileged-operation controls remain.</w:t>
             </w:r>
           </w:p>
         </w:tc>
@@ -1493,7 +1493,7 @@
           </w:tcPr>
           <w:p>
             <w:r>
-              <w:t>E2-005</w:t>
+              <w:t>2.3-05</w:t>
             </w:r>
           </w:p>
         </w:tc>
@@ -1503,7 +1503,7 @@
           </w:tcPr>
           <w:p>
             <w:r>
-              <w:t>Health API</w:t>
+              <w:t>SQLite Foundation</w:t>
             </w:r>
           </w:p>
         </w:tc>
@@ -1533,7 +1533,7 @@
           </w:tcPr>
           <w:p>
             <w:r>
-              <w:t>Implemented and verified</w:t>
+              <w:t>Not started.</w:t>
             </w:r>
           </w:p>
         </w:tc>
@@ -1545,7 +1545,7 @@
           </w:tcPr>
           <w:p>
             <w:r>
-              <w:t>E2-006</w:t>
+              <w:t>2.3-06</w:t>
             </w:r>
           </w:p>
         </w:tc>
@@ -1555,7 +1555,7 @@
           </w:tcPr>
           <w:p>
             <w:r>
-              <w:t>Diagnostics</w:t>
+              <w:t>Agent Capability Registry</w:t>
             </w:r>
           </w:p>
         </w:tc>
@@ -1585,7 +1585,7 @@
           </w:tcPr>
           <w:p>
             <w:r>
-              <w:t>Implemented and verified</w:t>
+              <w:t>Not started.</w:t>
             </w:r>
           </w:p>
         </w:tc>
@@ -1597,7 +1597,7 @@
           </w:tcPr>
           <w:p>
             <w:r>
-              <w:t>E2-007</w:t>
+              <w:t>2.3-07</w:t>
             </w:r>
           </w:p>
         </w:tc>
@@ -1607,7 +1607,7 @@
           </w:tcPr>
           <w:p>
             <w:r>
-              <w:t>Security</w:t>
+              <w:t>Serial-port Enumeration</w:t>
             </w:r>
           </w:p>
         </w:tc>
@@ -1637,7 +1637,7 @@
           </w:tcPr>
           <w:p>
             <w:r>
-              <w:t>Implemented and verified</w:t>
+              <w:t>Not started.</w:t>
             </w:r>
           </w:p>
         </w:tc>
@@ -1649,7 +1649,7 @@
           </w:tcPr>
           <w:p>
             <w:r>
-              <w:t>E2-008</w:t>
+              <w:t>2.3-08</w:t>
             </w:r>
           </w:p>
         </w:tc>
@@ -1659,7 +1659,7 @@
           </w:tcPr>
           <w:p>
             <w:r>
-              <w:t>IPC</w:t>
+              <w:t>NMEA GNSS Adapter</w:t>
             </w:r>
           </w:p>
         </w:tc>
@@ -1689,7 +1689,7 @@
           </w:tcPr>
           <w:p>
             <w:r>
-              <w:t>Implemented and verified</w:t>
+              <w:t>Not started.</w:t>
             </w:r>
           </w:p>
         </w:tc>
@@ -1701,7 +1701,7 @@
           </w:tcPr>
           <w:p>
             <w:r>
-              <w:t>E2-009</w:t>
+              <w:t>2.3-09</w:t>
             </w:r>
           </w:p>
         </w:tc>
@@ -1711,7 +1711,7 @@
           </w:tcPr>
           <w:p>
             <w:r>
-              <w:t>Logging</w:t>
+              <w:t>Windows System Telemetry</w:t>
             </w:r>
           </w:p>
         </w:tc>
@@ -1741,7 +1741,7 @@
           </w:tcPr>
           <w:p>
             <w:r>
-              <w:t>Implemented and verified</w:t>
+              <w:t>Not started â€” use Windows-provided battery runtime estimates; improve authoritative AC/battery power-source reporting; validate collection runtime on supported hardware.</w:t>
             </w:r>
           </w:p>
         </w:tc>
@@ -1753,7 +1753,7 @@
           </w:tcPr>
           <w:p>
             <w:r>
-              <w:t>E2-010</w:t>
+              <w:t>2.3-10</w:t>
             </w:r>
           </w:p>
         </w:tc>
@@ -1763,7 +1763,7 @@
           </w:tcPr>
           <w:p>
             <w:r>
-              <w:t>Testing</w:t>
+              <w:t>Agent Diagnostics</w:t>
             </w:r>
           </w:p>
         </w:tc>
@@ -1793,7 +1793,7 @@
           </w:tcPr>
           <w:p>
             <w:r>
-              <w:t>Implemented and verified</w:t>
+              <w:t>Partially implemented â€” lifecycle logging and health exist; structured adapter diagnostics and redacted export remain.</w:t>
             </w:r>
           </w:p>
         </w:tc>

</xml_diff>

<commit_message>
Rebaseline planning for single-operator MVP
</commit_message>
<xml_diff>
--- a/docs/planning/Engineering_Backlog_v1.0_Part_1_Project_Foundation.docx
+++ b/docs/planning/Engineering_Backlog_v1.0_Part_1_Project_Foundation.docx
@@ -1,6 +1,6 @@
 
 <file path=word/document.xml><?xml version="1.0" encoding="utf-8"?>
-<w:document xmlns:wpc="http://schemas.microsoft.com/office/word/2010/wordprocessingCanvas" xmlns:mo="http://schemas.microsoft.com/office/mac/office/2008/main" xmlns:mc="http://schemas.openxmlformats.org/markup-compatibility/2006" xmlns:mv="urn:schemas-microsoft-com:mac:vml" xmlns:o="urn:schemas-microsoft-com:office:office" xmlns:r="http://schemas.openxmlformats.org/officeDocument/2006/relationships" xmlns:m="http://schemas.openxmlformats.org/officeDocument/2006/math" xmlns:v="urn:schemas-microsoft-com:vml" xmlns:wp14="http://schemas.microsoft.com/office/word/2010/wordprocessingDrawing" xmlns:wp="http://schemas.openxmlformats.org/drawingml/2006/wordprocessingDrawing" xmlns:w10="urn:schemas-microsoft-com:office:word" xmlns:w="http://schemas.openxmlformats.org/wordprocessingml/2006/main" xmlns:w14="http://schemas.microsoft.com/office/word/2010/wordml" xmlns:wpg="http://schemas.microsoft.com/office/word/2010/wordprocessingGroup" xmlns:wpi="http://schemas.microsoft.com/office/word/2010/wordprocessingInk" xmlns:wne="http://schemas.microsoft.com/office/word/2006/wordml" xmlns:wps="http://schemas.microsoft.com/office/word/2010/wordprocessingShape" mc:Ignorable="w14 wp14">
+<w:document xmlns:ns1="http://schemas.openxmlformats.org/markup-compatibility/2006" xmlns:w="http://schemas.openxmlformats.org/wordprocessingml/2006/main" ns1:Ignorable="w14 wp14">
   <w:body>
     <w:p>
       <w:pPr>
@@ -2410,6 +2410,86 @@
         <w:t>Part 1 establishes the project governance and defines the first three epics. Part 2 will continue with Weather, System Monitoring, Launcher, and SmartLog+.</w:t>
       </w:r>
     </w:p>
+    <w:p>
+      <w:pPr>
+        <w:pStyle w:val="Heading 1"/>
+      </w:pPr>
+      <w:r>
+        <w:t>2026 Rebaseline Addendum ? Version 2.3 Disposition</w:t>
+      </w:r>
+    </w:p>
+    <w:p>
+      <w:pPr>
+        <w:pStyle w:val="Normal"/>
+      </w:pPr>
+      <w:r>
+        <w:t>This addendum reconciles the Local Agent backlog with the approved 2026 single-operator rebaseline and ADR-007. Existing task IDs and completed architectural work are preserved.</w:t>
+      </w:r>
+    </w:p>
+    <w:p>
+      <w:pPr>
+        <w:pStyle w:val="Heading 2"/>
+      </w:pPr>
+      <w:r>
+        <w:t>Version 2.3 ? Single-Operator Field MVP</w:t>
+      </w:r>
+    </w:p>
+    <w:p>
+      <w:pPr>
+        <w:pStyle w:val="Normal"/>
+      </w:pPr>
+      <w:r>
+        <w:t>Objective: dependable single-operator ToughBook/ToughPad operation with practical tray behavior, real GNSS, real Windows system telemetry, honest failures, dependable startup/deployment, and representative field validation.</w:t>
+      </w:r>
+    </w:p>
+    <w:p>
+      <w:pPr>
+        <w:pStyle w:val="Normal"/>
+      </w:pPr>
+      <w:r>
+        <w:t>2.3-01 is complete. 2.3-02 is operationally complete with representative hardware evidence; exotic environmental cases are deferred. 2.3-03 is narrowed to normal operator startup, one instance per normal session, service/native-health status, Open Dashboard, supported restart, visual Exit, login startup, clean relaunch, service continuity, and primary hardware validation. Authorized Healthy and unauthorized Access Denied evidence is complete; separate-session and enterprise workflows are deferred.</w:t>
+      </w:r>
+    </w:p>
+    <w:p>
+      <w:pPr>
+        <w:pStyle w:val="Normal"/>
+      </w:pPr>
+      <w:r>
+        <w:t>2.3-04 remains a minimum loopback/authenticated local API task. 2.3-05 and 2.3-06 are deferred pending concrete feature need. 2.3-07 remains active and prioritized. 2.3-08 and 2.3-09 are high-priority MVP work. 2.3-10 is limited to useful local diagnostics and redacted export.</w:t>
+      </w:r>
+    </w:p>
+    <w:p>
+      <w:pPr>
+        <w:pStyle w:val="Heading 2"/>
+      </w:pPr>
+      <w:r>
+        <w:t>Prioritization rule</w:t>
+      </w:r>
+    </w:p>
+    <w:p>
+      <w:pPr>
+        <w:pStyle w:val="Normal"/>
+      </w:pPr>
+      <w:r>
+        <w:t>Judge every active task by operator value, trustworthiness benefit, reliability benefit, direct dependency for a near-term field feature, current single-operator relevance, and effort. Infrastructure without a direct near-term field dependency defaults to deferred.</w:t>
+      </w:r>
+    </w:p>
+    <w:p>
+      <w:pPr>
+        <w:pStyle w:val="Heading 2"/>
+      </w:pPr>
+      <w:r>
+        <w:t>Deferred future section</w:t>
+      </w:r>
+    </w:p>
+    <w:p>
+      <w:pPr>
+        <w:pStyle w:val="Normal"/>
+      </w:pPr>
+      <w:r>
+        <w:t>Future Deployment and Enterprise Hardening is deferred, not abandoned: multi-user provisioning, separate sessions, Fast User Switching, RDP, signing, enterprise MSI hardening, fleet deployment, centralized policy, advanced credential lifecycle, generalized privileged APIs, remote administration, and enterprise diagnostics.</w:t>
+      </w:r>
+    </w:p>
     <w:sectPr>
       <w:pgSz w:w="12240" w:h="15840"/>
       <w:pgMar w:top="1440" w:right="1800" w:bottom="1440" w:left="1800" w:header="720" w:footer="720" w:gutter="0"/>

</xml_diff>